<commit_message>
Tâm máy cty 16.1 2h35 đã chạy phần lấy text lý do chọn nhà cung cấp
</commit_message>
<xml_diff>
--- a/Templates/Contract/BM-15-06 TỜ TRÌNH XIN CHỦ TRƯƠNG - Templates.docx
+++ b/Templates/Contract/BM-15-06 TỜ TRÌNH XIN CHỦ TRƯƠNG - Templates.docx
@@ -726,6 +726,31 @@
         <w:t>{{CANCU}}</w:t>
       </w:r>
     </w:p>
+    <w:p>
+      <w:pPr>
+        <w:pStyle w:val="ListParagraph"/>
+        <w:tabs>
+          <w:tab w:val="left" w:pos="284"/>
+        </w:tabs>
+        <w:spacing w:before="60" w:after="60" w:line="276" w:lineRule="auto"/>
+        <w:ind w:left="0" w:firstLine="567"/>
+        <w:contextualSpacing w:val="0"/>
+        <w:jc w:val="both"/>
+        <w:rPr>
+          <w:color w:val="0D0D0D" w:themeColor="text1" w:themeTint="F2"/>
+          <w:sz w:val="28"/>
+          <w:szCs w:val="28"/>
+        </w:rPr>
+      </w:pPr>
+      <w:r>
+        <w:rPr>
+          <w:color w:val="0D0D0D" w:themeColor="text1" w:themeTint="F2"/>
+          <w:sz w:val="28"/>
+          <w:szCs w:val="28"/>
+        </w:rPr>
+        <w:t>{{LYDOCHONNCC}}</w:t>
+      </w:r>
+    </w:p>
     <w:bookmarkEnd w:id="2"/>
     <w:p>
       <w:pPr>
@@ -1524,6 +1549,7 @@
           <w:sz w:val="28"/>
           <w:szCs w:val="28"/>
         </w:rPr>
+        <w:lastRenderedPageBreak/>
         <w:t xml:space="preserve">  Nội dung</w:t>
       </w:r>
       <w:r>
@@ -1557,7 +1583,6 @@
           <w:sz w:val="28"/>
           <w:szCs w:val="28"/>
         </w:rPr>
-        <w:lastRenderedPageBreak/>
         <w:t xml:space="preserve">Bên A đồng ý giao </w:t>
       </w:r>
       <w:r>
@@ -3354,6 +3379,7 @@
                 <w:szCs w:val="28"/>
                 <w:lang w:eastAsia="ko-KR"/>
               </w:rPr>
+              <w:lastRenderedPageBreak/>
               <w:t>LẬP BẢNG</w:t>
             </w:r>
           </w:p>
@@ -8703,7 +8729,6 @@
   <w:style w:type="character" w:default="1" w:styleId="DefaultParagraphFont">
     <w:name w:val="Default Paragraph Font"/>
     <w:uiPriority w:val="1"/>
-    <w:semiHidden/>
     <w:unhideWhenUsed/>
   </w:style>
   <w:style w:type="table" w:default="1" w:styleId="TableNormal">
@@ -9386,6 +9411,19 @@
 </file>
 
 <file path=customXml/item1.xml><?xml version="1.0" encoding="utf-8"?>
+<b:Sources xmlns:b="http://schemas.openxmlformats.org/officeDocument/2006/bibliography" xmlns="http://schemas.openxmlformats.org/officeDocument/2006/bibliography" SelectedStyle="\APA.XSL" StyleName="APA"/>
+</file>
+
+<file path=customXml/item2.xml><?xml version="1.0" encoding="utf-8"?>
+<?mso-contentType ?>
+<FormTemplates xmlns="http://schemas.microsoft.com/sharepoint/v3/contenttype/forms">
+  <Display>DocumentLibraryForm</Display>
+  <Edit>DocumentLibraryForm</Edit>
+  <New>DocumentLibraryForm</New>
+</FormTemplates>
+</file>
+
+<file path=customXml/item3.xml><?xml version="1.0" encoding="utf-8"?>
 <ct:contentTypeSchema xmlns:ct="http://schemas.microsoft.com/office/2006/metadata/contentType" xmlns:ma="http://schemas.microsoft.com/office/2006/metadata/properties/metaAttributes" ct:_="" ma:_="" ma:contentTypeName="Document" ma:contentTypeID="0x010100805D4BEE55A24044BDE0D112F050CC83" ma:contentTypeVersion="1" ma:contentTypeDescription="Create a new document." ma:contentTypeScope="" ma:versionID="bfe3fb2b52072bba3ef6a4f234377cf8">
   <xsd:schema xmlns:xsd="http://www.w3.org/2001/XMLSchema" xmlns:xs="http://www.w3.org/2001/XMLSchema" xmlns:p="http://schemas.microsoft.com/office/2006/metadata/properties" targetNamespace="http://schemas.microsoft.com/office/2006/metadata/properties" ma:root="true" ma:fieldsID="3168da399c7eed0b2303d422f0440ed6">
     <xsd:element name="properties">
@@ -9499,26 +9537,29 @@
 </ct:contentTypeSchema>
 </file>
 
-<file path=customXml/item2.xml><?xml version="1.0" encoding="utf-8"?>
+<file path=customXml/item4.xml><?xml version="1.0" encoding="utf-8"?>
 <p:properties xmlns:p="http://schemas.microsoft.com/office/2006/metadata/properties" xmlns:xsi="http://www.w3.org/2001/XMLSchema-instance" xmlns:pc="http://schemas.microsoft.com/office/infopath/2007/PartnerControls">
   <documentManagement/>
 </p:properties>
 </file>
 
-<file path=customXml/item3.xml><?xml version="1.0" encoding="utf-8"?>
-<b:Sources xmlns:b="http://schemas.openxmlformats.org/officeDocument/2006/bibliography" xmlns="http://schemas.openxmlformats.org/officeDocument/2006/bibliography" SelectedStyle="\APA.XSL" StyleName="APA"/>
+<file path=customXml/itemProps1.xml><?xml version="1.0" encoding="utf-8"?>
+<ds:datastoreItem xmlns:ds="http://schemas.openxmlformats.org/officeDocument/2006/customXml" ds:itemID="{9D0953AE-9A60-4325-AE9E-24D4E9F9FB75}">
+  <ds:schemaRefs>
+    <ds:schemaRef ds:uri="http://schemas.openxmlformats.org/officeDocument/2006/bibliography"/>
+  </ds:schemaRefs>
+</ds:datastoreItem>
 </file>
 
-<file path=customXml/item4.xml><?xml version="1.0" encoding="utf-8"?>
-<?mso-contentType ?>
-<FormTemplates xmlns="http://schemas.microsoft.com/sharepoint/v3/contenttype/forms">
-  <Display>DocumentLibraryForm</Display>
-  <Edit>DocumentLibraryForm</Edit>
-  <New>DocumentLibraryForm</New>
-</FormTemplates>
+<file path=customXml/itemProps2.xml><?xml version="1.0" encoding="utf-8"?>
+<ds:datastoreItem xmlns:ds="http://schemas.openxmlformats.org/officeDocument/2006/customXml" ds:itemID="{E2160846-F788-4AEA-B56E-7BF01218901D}">
+  <ds:schemaRefs>
+    <ds:schemaRef ds:uri="http://schemas.microsoft.com/sharepoint/v3/contenttype/forms"/>
+  </ds:schemaRefs>
+</ds:datastoreItem>
 </file>
 
-<file path=customXml/itemProps1.xml><?xml version="1.0" encoding="utf-8"?>
+<file path=customXml/itemProps3.xml><?xml version="1.0" encoding="utf-8"?>
 <ds:datastoreItem xmlns:ds="http://schemas.openxmlformats.org/officeDocument/2006/customXml" ds:itemID="{8E3BA125-43CC-44A9-9FCA-63E6975CACC6}">
   <ds:schemaRefs>
     <ds:schemaRef ds:uri="http://schemas.microsoft.com/office/2006/metadata/contentType"/>
@@ -9534,27 +9575,11 @@
 </ds:datastoreItem>
 </file>
 
-<file path=customXml/itemProps2.xml><?xml version="1.0" encoding="utf-8"?>
+<file path=customXml/itemProps4.xml><?xml version="1.0" encoding="utf-8"?>
 <ds:datastoreItem xmlns:ds="http://schemas.openxmlformats.org/officeDocument/2006/customXml" ds:itemID="{C4AF9458-447F-428E-8BFB-D288D293C150}">
   <ds:schemaRefs>
     <ds:schemaRef ds:uri="http://schemas.microsoft.com/office/2006/metadata/properties"/>
     <ds:schemaRef ds:uri="http://schemas.microsoft.com/office/infopath/2007/PartnerControls"/>
   </ds:schemaRefs>
 </ds:datastoreItem>
-</file>
-
-<file path=customXml/itemProps3.xml><?xml version="1.0" encoding="utf-8"?>
-<ds:datastoreItem xmlns:ds="http://schemas.openxmlformats.org/officeDocument/2006/customXml" ds:itemID="{9D0953AE-9A60-4325-AE9E-24D4E9F9FB75}">
-  <ds:schemaRefs>
-    <ds:schemaRef ds:uri="http://schemas.openxmlformats.org/officeDocument/2006/bibliography"/>
-  </ds:schemaRefs>
-</ds:datastoreItem>
-</file>
-
-<file path=customXml/itemProps4.xml><?xml version="1.0" encoding="utf-8"?>
-<ds:datastoreItem xmlns:ds="http://schemas.openxmlformats.org/officeDocument/2006/customXml" ds:itemID="{E2160846-F788-4AEA-B56E-7BF01218901D}">
-  <ds:schemaRefs>
-    <ds:schemaRef ds:uri="http://schemas.microsoft.com/sharepoint/v3/contenttype/forms"/>
-  </ds:schemaRefs>
-</ds:datastoreItem>
 </file>
</xml_diff>